<commit_message>
docs: apply legal feedback to public html and docx assets
</commit_message>
<xml_diff>
--- a/public/docs/consent.docx
+++ b/public/docs/consent.docx
@@ -26,13 +26,8 @@
       <w:r>
         <w:t xml:space="preserve">, свободно, своей волей и в своем интересе даю согласие физическому лицу </w:t>
       </w:r>
-      <w:proofErr w:type="spellStart"/>
-      <w:r>
-        <w:t>Докторовой</w:t>
-      </w:r>
-      <w:proofErr w:type="spellEnd"/>
-      <w:r>
-        <w:t xml:space="preserve"> Светлане Викторовне</w:t>
+      <w:r>
+        <w:t>Докторовой Светлане Викторовне</w:t>
       </w:r>
       <w:r>
         <w:t xml:space="preserve"> (ИНН: </w:t>
@@ -41,7 +36,13 @@
         <w:t>782608845206</w:t>
       </w:r>
       <w:r>
-        <w:t>, электронная почта: [E-mail]), применяющему специальный налоговый режим «Налог на профессиональный доход» (далее — «Оператор»), на обработку моих персональных данных.</w:t>
+        <w:t xml:space="preserve">, электронная почта: </w:t>
+      </w:r>
+      <w:r>
+        <w:t>info@tochilka.app</w:t>
+      </w:r>
+      <w:r>
+        <w:t>), применяющему специальный налоговый режим «Налог на профессиональный доход» (далее — «Оператор»), на обработку моих персональных данных.</w:t>
       </w:r>
     </w:p>
     <w:p>
@@ -61,15 +62,7 @@
         </w:numPr>
       </w:pPr>
       <w:r>
-        <w:t>Адрес электронной почты (</w:t>
-      </w:r>
-      <w:proofErr w:type="spellStart"/>
-      <w:r>
-        <w:t>e-mail</w:t>
-      </w:r>
-      <w:proofErr w:type="spellEnd"/>
-      <w:r>
-        <w:t>);</w:t>
+        <w:t>Адрес электронной почты (e-mail);</w:t>
       </w:r>
     </w:p>
     <w:p>
@@ -1092,6 +1085,7 @@
   <w:style w:type="character" w:default="1" w:styleId="a0">
     <w:name w:val="Default Paragraph Font"/>
     <w:uiPriority w:val="1"/>
+    <w:semiHidden/>
     <w:unhideWhenUsed/>
   </w:style>
   <w:style w:type="table" w:default="1" w:styleId="a1">

</xml_diff>